<commit_message>
fix(docx): update ASVS 5 footer
</commit_message>
<xml_diff>
--- a/5.0/templates/reference.docx
+++ b/5.0/templates/reference.docx
@@ -468,7 +468,7 @@
                 <w:rPr>
                   <w:szCs w:val="20"/>
                 </w:rPr>
-                <w:t>OWASP Application Security Verification Standard 4.0</w:t>
+                <w:t>OWASP Application Security Verification Standard 5.0.0</w:t>
               </w:r>
             </w:p>
           </w:tc>
@@ -529,7 +529,7 @@
                 <w:rPr>
                   <w:szCs w:val="20"/>
                 </w:rPr>
-                <w:t>OWASP Application Security Verification Standard 4.0</w:t>
+                <w:t>OWASP Application Security Verification Standard 5.0.0</w:t>
               </w:r>
             </w:p>
           </w:tc>

</xml_diff>

<commit_message>
chore(zh-cn): keep shared footer fix separate
</commit_message>
<xml_diff>
--- a/5.0/templates/reference.docx
+++ b/5.0/templates/reference.docx
@@ -468,7 +468,7 @@
                 <w:rPr>
                   <w:szCs w:val="20"/>
                 </w:rPr>
-                <w:t>OWASP Application Security Verification Standard 5.0.0</w:t>
+                <w:t>OWASP Application Security Verification Standard 4.0</w:t>
               </w:r>
             </w:p>
           </w:tc>
@@ -529,7 +529,7 @@
                 <w:rPr>
                   <w:szCs w:val="20"/>
                 </w:rPr>
-                <w:t>OWASP Application Security Verification Standard 5.0.0</w:t>
+                <w:t>OWASP Application Security Verification Standard 4.0</w:t>
               </w:r>
             </w:p>
           </w:tc>

</xml_diff>

<commit_message>
docs: add translation metadata and correct ASVS 5 DOCX footer (#3415)
* docs: add Arabic, Simplified Chinese, and Polish metadata

* chore: add translation contributors to spellcheck dictionary

* fix(docx): update ASVS 5 footer

(cherry picked from commit 80506285a4af0e76093794739fefcc58bad31c88)
</commit_message>
<xml_diff>
--- a/5.0/templates/reference.docx
+++ b/5.0/templates/reference.docx
@@ -468,7 +468,7 @@
                 <w:rPr>
                   <w:szCs w:val="20"/>
                 </w:rPr>
-                <w:t>OWASP Application Security Verification Standard 4.0</w:t>
+                <w:t>OWASP Application Security Verification Standard 5.0.0</w:t>
               </w:r>
             </w:p>
           </w:tc>
@@ -529,7 +529,7 @@
                 <w:rPr>
                   <w:szCs w:val="20"/>
                 </w:rPr>
-                <w:t>OWASP Application Security Verification Standard 4.0</w:t>
+                <w:t>OWASP Application Security Verification Standard 5.0.0</w:t>
               </w:r>
             </w:p>
           </w:tc>

</xml_diff>